<commit_message>
Regenerate CHANGES_ONLY.docx with clean justified 1.5-spaced body paragraphs and no extra blank spacer lines between blocks/tables/figures; tables no trailing blank; page breaks moved between blocks
Co-authored-by: arena-agent <297053741+arena-agent@users.noreply.github.com>
</commit_message>
<xml_diff>
--- a/reports/paste/CHANGES_ONLY.docx
+++ b/reports/paste/CHANGES_ONLY.docx
@@ -34,6 +34,9 @@
             <w:shd w:val="clear" w:fill="D9E2F3"/>
           </w:tcPr>
           <w:p>
+            <w:pPr>
+              <w:spacing w:after="40"/>
+            </w:pPr>
             <w:r>
               <w:rPr>
                 <w:rFonts w:ascii="Times New Roman" w:hAnsi="Times New Roman"/>
@@ -45,6 +48,9 @@
             </w:r>
           </w:p>
           <w:p>
+            <w:pPr>
+              <w:spacing w:after="40"/>
+            </w:pPr>
             <w:r>
               <w:rPr>
                 <w:rFonts w:ascii="Times New Roman" w:hAnsi="Times New Roman"/>
@@ -55,6 +61,9 @@
             </w:r>
           </w:p>
           <w:p>
+            <w:pPr>
+              <w:spacing w:after="0"/>
+            </w:pPr>
             <w:r>
               <w:rPr>
                 <w:rFonts w:ascii="Times New Roman" w:hAnsi="Times New Roman"/>
@@ -68,10 +77,10 @@
         </w:tc>
       </w:tr>
     </w:tbl>
-    <w:p/>
     <w:p>
       <w:pPr>
         <w:pStyle w:val="Heading1"/>
+        <w:spacing w:before="200" w:after="120"/>
       </w:pPr>
       <w:r>
         <w:t>LIST OF FIGURES</w:t>
@@ -79,6 +88,7 @@
     </w:p>
     <w:p>
       <w:pPr>
+        <w:spacing w:line="360" w:lineRule="auto" w:after="120" w:before="0"/>
         <w:jc w:val="both"/>
       </w:pPr>
       <w:r>
@@ -106,6 +116,9 @@
             <w:shd w:val="clear" w:fill="D9E2F3"/>
           </w:tcPr>
           <w:p>
+            <w:pPr>
+              <w:spacing w:after="40"/>
+            </w:pPr>
             <w:r>
               <w:rPr>
                 <w:rFonts w:ascii="Times New Roman" w:hAnsi="Times New Roman"/>
@@ -117,6 +130,9 @@
             </w:r>
           </w:p>
           <w:p>
+            <w:pPr>
+              <w:spacing w:after="40"/>
+            </w:pPr>
             <w:r>
               <w:rPr>
                 <w:rFonts w:ascii="Times New Roman" w:hAnsi="Times New Roman"/>
@@ -127,6 +143,9 @@
             </w:r>
           </w:p>
           <w:p>
+            <w:pPr>
+              <w:spacing w:after="0"/>
+            </w:pPr>
             <w:r>
               <w:rPr>
                 <w:rFonts w:ascii="Times New Roman" w:hAnsi="Times New Roman"/>
@@ -140,10 +159,10 @@
         </w:tc>
       </w:tr>
     </w:tbl>
-    <w:p/>
     <w:p>
       <w:pPr>
         <w:pStyle w:val="Heading1"/>
+        <w:spacing w:before="200" w:after="120"/>
       </w:pPr>
       <w:r>
         <w:t>LIST OF TABLES</w:t>
@@ -151,6 +170,7 @@
     </w:p>
     <w:p>
       <w:pPr>
+        <w:spacing w:line="360" w:lineRule="auto" w:after="120" w:before="0"/>
         <w:jc w:val="both"/>
       </w:pPr>
       <w:r>
@@ -178,6 +198,9 @@
             <w:shd w:val="clear" w:fill="D9E2F3"/>
           </w:tcPr>
           <w:p>
+            <w:pPr>
+              <w:spacing w:after="40"/>
+            </w:pPr>
             <w:r>
               <w:rPr>
                 <w:rFonts w:ascii="Times New Roman" w:hAnsi="Times New Roman"/>
@@ -189,6 +212,9 @@
             </w:r>
           </w:p>
           <w:p>
+            <w:pPr>
+              <w:spacing w:after="40"/>
+            </w:pPr>
             <w:r>
               <w:rPr>
                 <w:rFonts w:ascii="Times New Roman" w:hAnsi="Times New Roman"/>
@@ -199,6 +225,9 @@
             </w:r>
           </w:p>
           <w:p>
+            <w:pPr>
+              <w:spacing w:after="0"/>
+            </w:pPr>
             <w:r>
               <w:rPr>
                 <w:rFonts w:ascii="Times New Roman" w:hAnsi="Times New Roman"/>
@@ -212,10 +241,10 @@
         </w:tc>
       </w:tr>
     </w:tbl>
-    <w:p/>
     <w:p>
       <w:pPr>
         <w:pStyle w:val="Heading1"/>
+        <w:spacing w:before="200" w:after="120"/>
       </w:pPr>
       <w:r>
         <w:t>CHAPTER 1: INTRODUCTION</w:t>
@@ -223,6 +252,7 @@
     </w:p>
     <w:p>
       <w:pPr>
+        <w:spacing w:line="360" w:lineRule="auto" w:after="120" w:before="0"/>
         <w:jc w:val="both"/>
       </w:pPr>
       <w:r>
@@ -231,6 +261,7 @@
     </w:p>
     <w:p>
       <w:pPr>
+        <w:spacing w:before="120" w:after="40"/>
         <w:jc w:val="center"/>
       </w:pPr>
       <w:r>
@@ -270,6 +301,7 @@
     </w:p>
     <w:p>
       <w:pPr>
+        <w:spacing w:after="160"/>
         <w:jc w:val="center"/>
       </w:pPr>
       <w:r>
@@ -282,9 +314,9 @@
         <w:t>Figure 1.1: Spam as a share of worldwide email traffic in 2024 (Kaspersky Securelist [18</w:t>
       </w:r>
     </w:p>
-    <w:p/>
     <w:p>
       <w:pPr>
+        <w:spacing w:line="360" w:lineRule="auto" w:after="120" w:before="0"/>
         <w:jc w:val="both"/>
       </w:pPr>
       <w:r>
@@ -293,6 +325,7 @@
     </w:p>
     <w:p>
       <w:pPr>
+        <w:spacing w:before="120" w:after="40"/>
         <w:jc w:val="center"/>
       </w:pPr>
       <w:r>
@@ -332,6 +365,7 @@
     </w:p>
     <w:p>
       <w:pPr>
+        <w:spacing w:after="160"/>
         <w:jc w:val="center"/>
       </w:pPr>
       <w:r>
@@ -344,9 +378,9 @@
         <w:t>Figure 1.2: Phishing attacks recorded per quarter in 2024 (Anti-Phishing Working Group [20</w:t>
       </w:r>
     </w:p>
-    <w:p/>
     <w:p>
       <w:pPr>
+        <w:spacing w:line="360" w:lineRule="auto" w:after="120" w:before="0"/>
         <w:jc w:val="both"/>
       </w:pPr>
       <w:r>
@@ -355,6 +389,7 @@
     </w:p>
     <w:p>
       <w:pPr>
+        <w:spacing w:before="120" w:after="40"/>
         <w:jc w:val="center"/>
       </w:pPr>
       <w:r>
@@ -394,6 +429,7 @@
     </w:p>
     <w:p>
       <w:pPr>
+        <w:spacing w:after="160"/>
         <w:jc w:val="center"/>
       </w:pPr>
       <w:r>
@@ -406,9 +442,9 @@
         <w:t>Figure 1.3: Summary of key email-security threat statistics from recent official reports</w:t>
       </w:r>
     </w:p>
-    <w:p/>
     <w:p>
       <w:pPr>
+        <w:spacing w:line="360" w:lineRule="auto" w:after="120" w:before="0"/>
         <w:jc w:val="both"/>
       </w:pPr>
       <w:r>
@@ -417,6 +453,7 @@
     </w:p>
     <w:p>
       <w:pPr>
+        <w:spacing w:line="360" w:lineRule="auto" w:after="120" w:before="0"/>
         <w:jc w:val="both"/>
       </w:pPr>
       <w:r>
@@ -444,6 +481,9 @@
             <w:shd w:val="clear" w:fill="D9E2F3"/>
           </w:tcPr>
           <w:p>
+            <w:pPr>
+              <w:spacing w:after="40"/>
+            </w:pPr>
             <w:r>
               <w:rPr>
                 <w:rFonts w:ascii="Times New Roman" w:hAnsi="Times New Roman"/>
@@ -455,6 +495,9 @@
             </w:r>
           </w:p>
           <w:p>
+            <w:pPr>
+              <w:spacing w:after="40"/>
+            </w:pPr>
             <w:r>
               <w:rPr>
                 <w:rFonts w:ascii="Times New Roman" w:hAnsi="Times New Roman"/>
@@ -465,6 +508,9 @@
             </w:r>
           </w:p>
           <w:p>
+            <w:pPr>
+              <w:spacing w:after="0"/>
+            </w:pPr>
             <w:r>
               <w:rPr>
                 <w:rFonts w:ascii="Times New Roman" w:hAnsi="Times New Roman"/>
@@ -478,10 +524,10 @@
         </w:tc>
       </w:tr>
     </w:tbl>
-    <w:p/>
     <w:p>
       <w:pPr>
         <w:pStyle w:val="Heading2"/>
+        <w:spacing w:before="200" w:after="120"/>
       </w:pPr>
       <w:r>
         <w:t>1.1 Problem Statement and Motivation</w:t>
@@ -489,6 +535,7 @@
     </w:p>
     <w:p>
       <w:pPr>
+        <w:spacing w:line="360" w:lineRule="auto" w:after="120" w:before="0"/>
         <w:jc w:val="both"/>
       </w:pPr>
       <w:r>
@@ -497,6 +544,7 @@
     </w:p>
     <w:p>
       <w:pPr>
+        <w:spacing w:line="360" w:lineRule="auto" w:after="120" w:before="0"/>
         <w:jc w:val="both"/>
       </w:pPr>
       <w:r>
@@ -505,6 +553,7 @@
     </w:p>
     <w:p>
       <w:pPr>
+        <w:spacing w:line="360" w:lineRule="auto" w:after="120" w:before="0"/>
         <w:jc w:val="both"/>
       </w:pPr>
       <w:r>
@@ -532,6 +581,9 @@
             <w:shd w:val="clear" w:fill="D9E2F3"/>
           </w:tcPr>
           <w:p>
+            <w:pPr>
+              <w:spacing w:after="40"/>
+            </w:pPr>
             <w:r>
               <w:rPr>
                 <w:rFonts w:ascii="Times New Roman" w:hAnsi="Times New Roman"/>
@@ -543,6 +595,9 @@
             </w:r>
           </w:p>
           <w:p>
+            <w:pPr>
+              <w:spacing w:after="40"/>
+            </w:pPr>
             <w:r>
               <w:rPr>
                 <w:rFonts w:ascii="Times New Roman" w:hAnsi="Times New Roman"/>
@@ -553,6 +608,9 @@
             </w:r>
           </w:p>
           <w:p>
+            <w:pPr>
+              <w:spacing w:after="0"/>
+            </w:pPr>
             <w:r>
               <w:rPr>
                 <w:rFonts w:ascii="Times New Roman" w:hAnsi="Times New Roman"/>
@@ -566,18 +624,29 @@
         </w:tc>
       </w:tr>
     </w:tbl>
-    <w:p/>
     <w:p>
+      <w:pPr>
+        <w:spacing w:line="360" w:lineRule="auto" w:after="120"/>
+        <w:jc w:val="both"/>
+      </w:pPr>
       <w:r>
         <w:t>[18] Kaspersky, "Spam and phishing in 2024," Securelist, Kaspersky Lab, Feb. 2025. [Online]. Available: https://securelist.com/spam-and-phishing-report-2024/115536/</w:t>
       </w:r>
     </w:p>
     <w:p>
+      <w:pPr>
+        <w:spacing w:line="360" w:lineRule="auto" w:after="120"/>
+        <w:jc w:val="both"/>
+      </w:pPr>
       <w:r>
         <w:t>[19] Federal Bureau of Investigation, "2024 Internet Crime Report," Internet Crime Complaint Center (IC3), 2025. [Online]. Available: https://www.ic3.gov/AnnualReport/Reports</w:t>
       </w:r>
     </w:p>
     <w:p>
+      <w:pPr>
+        <w:spacing w:line="360" w:lineRule="auto" w:after="120"/>
+        <w:jc w:val="both"/>
+      </w:pPr>
       <w:r>
         <w:t>[20] Anti-Phishing Working Group, "Phishing Activity Trends Report, 2024," APWG, 2024-2025. [Online]. Available: https://apwg.org/resources/phishingactivitytrends/</w:t>
       </w:r>
@@ -603,6 +672,9 @@
             <w:shd w:val="clear" w:fill="D9E2F3"/>
           </w:tcPr>
           <w:p>
+            <w:pPr>
+              <w:spacing w:after="40"/>
+            </w:pPr>
             <w:r>
               <w:rPr>
                 <w:rFonts w:ascii="Times New Roman" w:hAnsi="Times New Roman"/>
@@ -614,6 +686,9 @@
             </w:r>
           </w:p>
           <w:p>
+            <w:pPr>
+              <w:spacing w:after="40"/>
+            </w:pPr>
             <w:r>
               <w:rPr>
                 <w:rFonts w:ascii="Times New Roman" w:hAnsi="Times New Roman"/>
@@ -624,6 +699,9 @@
             </w:r>
           </w:p>
           <w:p>
+            <w:pPr>
+              <w:spacing w:after="0"/>
+            </w:pPr>
             <w:r>
               <w:rPr>
                 <w:rFonts w:ascii="Times New Roman" w:hAnsi="Times New Roman"/>
@@ -637,10 +715,10 @@
         </w:tc>
       </w:tr>
     </w:tbl>
-    <w:p/>
     <w:p>
       <w:pPr>
         <w:pStyle w:val="Heading3"/>
+        <w:spacing w:before="200" w:after="120"/>
       </w:pPr>
       <w:r>
         <w:t>2.1.2 Firmware / Operating System</w:t>
@@ -648,6 +726,7 @@
     </w:p>
     <w:p>
       <w:pPr>
+        <w:spacing w:line="360" w:lineRule="auto" w:after="120" w:before="0"/>
         <w:jc w:val="both"/>
       </w:pPr>
       <w:r>
@@ -675,6 +754,9 @@
             <w:shd w:val="clear" w:fill="D9E2F3"/>
           </w:tcPr>
           <w:p>
+            <w:pPr>
+              <w:spacing w:after="40"/>
+            </w:pPr>
             <w:r>
               <w:rPr>
                 <w:rFonts w:ascii="Times New Roman" w:hAnsi="Times New Roman"/>
@@ -686,6 +768,9 @@
             </w:r>
           </w:p>
           <w:p>
+            <w:pPr>
+              <w:spacing w:after="40"/>
+            </w:pPr>
             <w:r>
               <w:rPr>
                 <w:rFonts w:ascii="Times New Roman" w:hAnsi="Times New Roman"/>
@@ -696,6 +781,9 @@
             </w:r>
           </w:p>
           <w:p>
+            <w:pPr>
+              <w:spacing w:after="0"/>
+            </w:pPr>
             <w:r>
               <w:rPr>
                 <w:rFonts w:ascii="Times New Roman" w:hAnsi="Times New Roman"/>
@@ -709,10 +797,10 @@
         </w:tc>
       </w:tr>
     </w:tbl>
-    <w:p/>
     <w:p>
       <w:pPr>
         <w:pStyle w:val="Heading2"/>
+        <w:spacing w:before="200" w:after="120"/>
       </w:pPr>
       <w:r>
         <w:t>2.4 Summary</w:t>
@@ -720,6 +808,7 @@
     </w:p>
     <w:p>
       <w:pPr>
+        <w:spacing w:line="360" w:lineRule="auto" w:after="120" w:before="0"/>
         <w:jc w:val="both"/>
       </w:pPr>
       <w:r>
@@ -747,6 +836,9 @@
             <w:shd w:val="clear" w:fill="D9E2F3"/>
           </w:tcPr>
           <w:p>
+            <w:pPr>
+              <w:spacing w:after="40"/>
+            </w:pPr>
             <w:r>
               <w:rPr>
                 <w:rFonts w:ascii="Times New Roman" w:hAnsi="Times New Roman"/>
@@ -758,6 +850,9 @@
             </w:r>
           </w:p>
           <w:p>
+            <w:pPr>
+              <w:spacing w:after="40"/>
+            </w:pPr>
             <w:r>
               <w:rPr>
                 <w:rFonts w:ascii="Times New Roman" w:hAnsi="Times New Roman"/>
@@ -768,6 +863,9 @@
             </w:r>
           </w:p>
           <w:p>
+            <w:pPr>
+              <w:spacing w:after="0"/>
+            </w:pPr>
             <w:r>
               <w:rPr>
                 <w:rFonts w:ascii="Times New Roman" w:hAnsi="Times New Roman"/>
@@ -781,10 +879,10 @@
         </w:tc>
       </w:tr>
     </w:tbl>
-    <w:p/>
     <w:p>
       <w:pPr>
         <w:pStyle w:val="Heading3"/>
+        <w:spacing w:before="200" w:after="120"/>
       </w:pPr>
       <w:r>
         <w:t>3.1.2 Use Case Diagram and Description</w:t>
@@ -792,6 +890,7 @@
     </w:p>
     <w:p>
       <w:pPr>
+        <w:spacing w:line="360" w:lineRule="auto" w:after="120" w:before="0"/>
         <w:jc w:val="both"/>
       </w:pPr>
       <w:r>
@@ -800,6 +899,7 @@
     </w:p>
     <w:p>
       <w:pPr>
+        <w:spacing w:before="120" w:after="40"/>
         <w:jc w:val="center"/>
       </w:pPr>
       <w:r>
@@ -839,6 +939,7 @@
     </w:p>
     <w:p>
       <w:pPr>
+        <w:spacing w:after="160"/>
         <w:jc w:val="center"/>
       </w:pPr>
       <w:r>
@@ -851,9 +952,9 @@
         <w:t>Figure 3.2: insert the use-case diagram for the reviewer/administrator actor</w:t>
       </w:r>
     </w:p>
-    <w:p/>
     <w:p>
       <w:pPr>
+        <w:spacing w:line="360" w:lineRule="auto" w:after="120" w:before="0"/>
         <w:jc w:val="both"/>
       </w:pPr>
       <w:r>
@@ -1403,7 +1504,6 @@
         </w:tc>
       </w:tr>
     </w:tbl>
-    <w:p/>
     <w:p>
       <w:r>
         <w:br w:type="page"/>
@@ -1425,6 +1525,9 @@
             <w:shd w:val="clear" w:fill="D9E2F3"/>
           </w:tcPr>
           <w:p>
+            <w:pPr>
+              <w:spacing w:after="40"/>
+            </w:pPr>
             <w:r>
               <w:rPr>
                 <w:rFonts w:ascii="Times New Roman" w:hAnsi="Times New Roman"/>
@@ -1436,6 +1539,9 @@
             </w:r>
           </w:p>
           <w:p>
+            <w:pPr>
+              <w:spacing w:after="40"/>
+            </w:pPr>
             <w:r>
               <w:rPr>
                 <w:rFonts w:ascii="Times New Roman" w:hAnsi="Times New Roman"/>
@@ -1446,6 +1552,9 @@
             </w:r>
           </w:p>
           <w:p>
+            <w:pPr>
+              <w:spacing w:after="0"/>
+            </w:pPr>
             <w:r>
               <w:rPr>
                 <w:rFonts w:ascii="Times New Roman" w:hAnsi="Times New Roman"/>
@@ -1459,10 +1568,10 @@
         </w:tc>
       </w:tr>
     </w:tbl>
-    <w:p/>
     <w:p>
       <w:pPr>
         <w:pStyle w:val="Heading2"/>
+        <w:spacing w:before="200" w:after="120"/>
       </w:pPr>
       <w:r>
         <w:t>3.3 Feature Extraction and Classification Approach</w:t>
@@ -1470,6 +1579,7 @@
     </w:p>
     <w:p>
       <w:pPr>
+        <w:spacing w:line="360" w:lineRule="auto" w:after="120" w:before="0"/>
         <w:jc w:val="both"/>
       </w:pPr>
       <w:r>
@@ -1484,6 +1594,7 @@
     </w:p>
     <w:p>
       <w:pPr>
+        <w:spacing w:line="360" w:lineRule="auto" w:after="120" w:before="0"/>
         <w:jc w:val="both"/>
       </w:pPr>
       <w:r>
@@ -1498,6 +1609,7 @@
     </w:p>
     <w:p>
       <w:pPr>
+        <w:spacing w:line="360" w:lineRule="auto" w:after="120" w:before="0"/>
         <w:jc w:val="both"/>
       </w:pPr>
       <w:r>
@@ -1512,6 +1624,7 @@
     </w:p>
     <w:p>
       <w:pPr>
+        <w:spacing w:line="360" w:lineRule="auto" w:after="120" w:before="0"/>
         <w:jc w:val="both"/>
       </w:pPr>
       <w:r>
@@ -1545,6 +1658,9 @@
             <w:shd w:val="clear" w:fill="D9E2F3"/>
           </w:tcPr>
           <w:p>
+            <w:pPr>
+              <w:spacing w:after="40"/>
+            </w:pPr>
             <w:r>
               <w:rPr>
                 <w:rFonts w:ascii="Times New Roman" w:hAnsi="Times New Roman"/>
@@ -1556,6 +1672,9 @@
             </w:r>
           </w:p>
           <w:p>
+            <w:pPr>
+              <w:spacing w:after="40"/>
+            </w:pPr>
             <w:r>
               <w:rPr>
                 <w:rFonts w:ascii="Times New Roman" w:hAnsi="Times New Roman"/>
@@ -1566,6 +1685,9 @@
             </w:r>
           </w:p>
           <w:p>
+            <w:pPr>
+              <w:spacing w:after="0"/>
+            </w:pPr>
             <w:r>
               <w:rPr>
                 <w:rFonts w:ascii="Times New Roman" w:hAnsi="Times New Roman"/>
@@ -1579,10 +1701,10 @@
         </w:tc>
       </w:tr>
     </w:tbl>
-    <w:p/>
     <w:p>
       <w:pPr>
         <w:pStyle w:val="Heading2"/>
+        <w:spacing w:before="200" w:after="120"/>
       </w:pPr>
       <w:r>
         <w:t>3.4 Evaluation Design and Performance Definitions</w:t>
@@ -1590,6 +1712,7 @@
     </w:p>
     <w:p>
       <w:pPr>
+        <w:spacing w:line="360" w:lineRule="auto" w:after="120" w:before="0"/>
         <w:jc w:val="both"/>
       </w:pPr>
       <w:r>
@@ -1617,6 +1740,9 @@
             <w:shd w:val="clear" w:fill="D9E2F3"/>
           </w:tcPr>
           <w:p>
+            <w:pPr>
+              <w:spacing w:after="40"/>
+            </w:pPr>
             <w:r>
               <w:rPr>
                 <w:rFonts w:ascii="Times New Roman" w:hAnsi="Times New Roman"/>
@@ -1628,6 +1754,9 @@
             </w:r>
           </w:p>
           <w:p>
+            <w:pPr>
+              <w:spacing w:after="40"/>
+            </w:pPr>
             <w:r>
               <w:rPr>
                 <w:rFonts w:ascii="Times New Roman" w:hAnsi="Times New Roman"/>
@@ -1638,6 +1767,9 @@
             </w:r>
           </w:p>
           <w:p>
+            <w:pPr>
+              <w:spacing w:after="0"/>
+            </w:pPr>
             <w:r>
               <w:rPr>
                 <w:rFonts w:ascii="Times New Roman" w:hAnsi="Times New Roman"/>
@@ -1651,10 +1783,10 @@
         </w:tc>
       </w:tr>
     </w:tbl>
-    <w:p/>
     <w:p>
       <w:pPr>
         <w:pStyle w:val="Heading2"/>
+        <w:spacing w:before="200" w:after="120"/>
       </w:pPr>
       <w:r>
         <w:t>4.1 System Block Diagram</w:t>
@@ -1662,6 +1794,7 @@
     </w:p>
     <w:p>
       <w:pPr>
+        <w:spacing w:line="360" w:lineRule="auto" w:after="120" w:before="0"/>
         <w:jc w:val="both"/>
       </w:pPr>
       <w:r>
@@ -1670,6 +1803,7 @@
     </w:p>
     <w:p>
       <w:pPr>
+        <w:spacing w:line="360" w:lineRule="auto" w:after="120" w:before="0"/>
         <w:jc w:val="both"/>
       </w:pPr>
       <w:r>
@@ -1723,6 +1857,7 @@
     </w:p>
     <w:p>
       <w:pPr>
+        <w:spacing w:before="120" w:after="40"/>
         <w:jc w:val="center"/>
       </w:pPr>
       <w:r>
@@ -1762,6 +1897,7 @@
     </w:p>
     <w:p>
       <w:pPr>
+        <w:spacing w:after="160"/>
         <w:jc w:val="center"/>
       </w:pPr>
       <w:r>
@@ -1774,9 +1910,9 @@
         <w:t>Figure 4.1: insert the system block diagram (ingestion, features, fusion, action, adaptation)</w:t>
       </w:r>
     </w:p>
-    <w:p/>
     <w:p>
       <w:pPr>
+        <w:spacing w:line="360" w:lineRule="auto" w:after="120" w:before="0"/>
         <w:jc w:val="both"/>
       </w:pPr>
       <w:r>
@@ -1804,6 +1940,9 @@
             <w:shd w:val="clear" w:fill="D9E2F3"/>
           </w:tcPr>
           <w:p>
+            <w:pPr>
+              <w:spacing w:after="40"/>
+            </w:pPr>
             <w:r>
               <w:rPr>
                 <w:rFonts w:ascii="Times New Roman" w:hAnsi="Times New Roman"/>
@@ -1815,6 +1954,9 @@
             </w:r>
           </w:p>
           <w:p>
+            <w:pPr>
+              <w:spacing w:after="40"/>
+            </w:pPr>
             <w:r>
               <w:rPr>
                 <w:rFonts w:ascii="Times New Roman" w:hAnsi="Times New Roman"/>
@@ -1825,6 +1967,9 @@
             </w:r>
           </w:p>
           <w:p>
+            <w:pPr>
+              <w:spacing w:after="0"/>
+            </w:pPr>
             <w:r>
               <w:rPr>
                 <w:rFonts w:ascii="Times New Roman" w:hAnsi="Times New Roman"/>
@@ -1838,10 +1983,10 @@
         </w:tc>
       </w:tr>
     </w:tbl>
-    <w:p/>
     <w:p>
       <w:pPr>
         <w:pStyle w:val="Heading2"/>
+        <w:spacing w:before="200" w:after="120"/>
       </w:pPr>
       <w:r>
         <w:t>4.2 System Components Specifications</w:t>
@@ -1849,6 +1994,7 @@
     </w:p>
     <w:p>
       <w:pPr>
+        <w:spacing w:line="360" w:lineRule="auto" w:after="120" w:before="0"/>
         <w:jc w:val="both"/>
       </w:pPr>
       <w:r>
@@ -1857,6 +2003,7 @@
     </w:p>
     <w:p>
       <w:pPr>
+        <w:spacing w:line="360" w:lineRule="auto" w:after="120" w:before="0"/>
         <w:jc w:val="both"/>
       </w:pPr>
       <w:r>
@@ -2554,10 +2701,10 @@
         </w:tc>
       </w:tr>
     </w:tbl>
-    <w:p/>
     <w:p>
       <w:pPr>
         <w:pStyle w:val="Heading3"/>
+        <w:spacing w:before="200" w:after="120"/>
       </w:pPr>
       <w:r>
         <w:t>4.2.1 Data Ingestion and Preparation</w:t>
@@ -2565,6 +2712,7 @@
     </w:p>
     <w:p>
       <w:pPr>
+        <w:spacing w:line="360" w:lineRule="auto" w:after="120" w:before="0"/>
         <w:jc w:val="both"/>
       </w:pPr>
       <w:r>
@@ -2574,6 +2722,7 @@
     <w:p>
       <w:pPr>
         <w:pStyle w:val="Heading3"/>
+        <w:spacing w:before="200" w:after="120"/>
       </w:pPr>
       <w:r>
         <w:t>4.2.2 Email Parsing and Feature Extraction</w:t>
@@ -2581,6 +2730,7 @@
     </w:p>
     <w:p>
       <w:pPr>
+        <w:spacing w:line="360" w:lineRule="auto" w:after="120" w:before="0"/>
         <w:jc w:val="both"/>
       </w:pPr>
       <w:r>
@@ -2590,6 +2740,7 @@
     <w:p>
       <w:pPr>
         <w:pStyle w:val="Heading3"/>
+        <w:spacing w:before="200" w:after="120"/>
       </w:pPr>
       <w:r>
         <w:t>4.2.3 Fusion Classification Engine</w:t>
@@ -2597,6 +2748,7 @@
     </w:p>
     <w:p>
       <w:pPr>
+        <w:spacing w:line="360" w:lineRule="auto" w:after="120" w:before="0"/>
         <w:jc w:val="both"/>
       </w:pPr>
       <w:r>
@@ -2606,6 +2758,7 @@
     <w:p>
       <w:pPr>
         <w:pStyle w:val="Heading3"/>
+        <w:spacing w:before="200" w:after="120"/>
       </w:pPr>
       <w:r>
         <w:t>4.2.4 Detection Service and Mailbox Scanner</w:t>
@@ -2613,6 +2766,7 @@
     </w:p>
     <w:p>
       <w:pPr>
+        <w:spacing w:line="360" w:lineRule="auto" w:after="120" w:before="0"/>
         <w:jc w:val="both"/>
       </w:pPr>
       <w:r>
@@ -2622,6 +2776,7 @@
     <w:p>
       <w:pPr>
         <w:pStyle w:val="Heading3"/>
+        <w:spacing w:before="200" w:after="120"/>
       </w:pPr>
       <w:r>
         <w:t>4.2.5 Review, Feedback and Adaptive Retraining</w:t>
@@ -2629,6 +2784,7 @@
     </w:p>
     <w:p>
       <w:pPr>
+        <w:spacing w:line="360" w:lineRule="auto" w:after="120" w:before="0"/>
         <w:jc w:val="both"/>
       </w:pPr>
       <w:r>
@@ -2656,6 +2812,9 @@
             <w:shd w:val="clear" w:fill="D9E2F3"/>
           </w:tcPr>
           <w:p>
+            <w:pPr>
+              <w:spacing w:after="40"/>
+            </w:pPr>
             <w:r>
               <w:rPr>
                 <w:rFonts w:ascii="Times New Roman" w:hAnsi="Times New Roman"/>
@@ -2667,6 +2826,9 @@
             </w:r>
           </w:p>
           <w:p>
+            <w:pPr>
+              <w:spacing w:after="40"/>
+            </w:pPr>
             <w:r>
               <w:rPr>
                 <w:rFonts w:ascii="Times New Roman" w:hAnsi="Times New Roman"/>
@@ -2677,6 +2839,9 @@
             </w:r>
           </w:p>
           <w:p>
+            <w:pPr>
+              <w:spacing w:after="0"/>
+            </w:pPr>
             <w:r>
               <w:rPr>
                 <w:rFonts w:ascii="Times New Roman" w:hAnsi="Times New Roman"/>
@@ -2690,10 +2855,10 @@
         </w:tc>
       </w:tr>
     </w:tbl>
-    <w:p/>
     <w:p>
       <w:pPr>
         <w:pStyle w:val="Heading2"/>
+        <w:spacing w:before="200" w:after="120"/>
       </w:pPr>
       <w:r>
         <w:t>4.3 Data and Feature Design</w:t>
@@ -2701,6 +2866,7 @@
     </w:p>
     <w:p>
       <w:pPr>
+        <w:spacing w:line="360" w:lineRule="auto" w:after="120" w:before="0"/>
         <w:jc w:val="both"/>
       </w:pPr>
       <w:r>
@@ -2709,6 +2875,7 @@
     </w:p>
     <w:p>
       <w:pPr>
+        <w:spacing w:line="360" w:lineRule="auto" w:after="120" w:before="0"/>
         <w:jc w:val="both"/>
       </w:pPr>
       <w:r>
@@ -3386,9 +3553,9 @@
         </w:tc>
       </w:tr>
     </w:tbl>
-    <w:p/>
     <w:p>
       <w:pPr>
+        <w:spacing w:line="360" w:lineRule="auto" w:after="120" w:before="0"/>
         <w:jc w:val="both"/>
       </w:pPr>
       <w:r>
@@ -3416,6 +3583,9 @@
             <w:shd w:val="clear" w:fill="D9E2F3"/>
           </w:tcPr>
           <w:p>
+            <w:pPr>
+              <w:spacing w:after="40"/>
+            </w:pPr>
             <w:r>
               <w:rPr>
                 <w:rFonts w:ascii="Times New Roman" w:hAnsi="Times New Roman"/>
@@ -3427,6 +3597,9 @@
             </w:r>
           </w:p>
           <w:p>
+            <w:pPr>
+              <w:spacing w:after="40"/>
+            </w:pPr>
             <w:r>
               <w:rPr>
                 <w:rFonts w:ascii="Times New Roman" w:hAnsi="Times New Roman"/>
@@ -3437,6 +3610,9 @@
             </w:r>
           </w:p>
           <w:p>
+            <w:pPr>
+              <w:spacing w:after="0"/>
+            </w:pPr>
             <w:r>
               <w:rPr>
                 <w:rFonts w:ascii="Times New Roman" w:hAnsi="Times New Roman"/>
@@ -3450,10 +3626,10 @@
         </w:tc>
       </w:tr>
     </w:tbl>
-    <w:p/>
     <w:p>
       <w:pPr>
         <w:pStyle w:val="Heading2"/>
+        <w:spacing w:before="200" w:after="120"/>
       </w:pPr>
       <w:r>
         <w:t>4.4 System Components Interaction Operations</w:t>
@@ -3461,6 +3637,7 @@
     </w:p>
     <w:p>
       <w:pPr>
+        <w:spacing w:line="360" w:lineRule="auto" w:after="120" w:before="0"/>
         <w:jc w:val="both"/>
       </w:pPr>
       <w:r>
@@ -3488,6 +3665,9 @@
             <w:shd w:val="clear" w:fill="D9E2F3"/>
           </w:tcPr>
           <w:p>
+            <w:pPr>
+              <w:spacing w:after="40"/>
+            </w:pPr>
             <w:r>
               <w:rPr>
                 <w:rFonts w:ascii="Times New Roman" w:hAnsi="Times New Roman"/>
@@ -3499,6 +3679,9 @@
             </w:r>
           </w:p>
           <w:p>
+            <w:pPr>
+              <w:spacing w:after="40"/>
+            </w:pPr>
             <w:r>
               <w:rPr>
                 <w:rFonts w:ascii="Times New Roman" w:hAnsi="Times New Roman"/>
@@ -3509,6 +3692,9 @@
             </w:r>
           </w:p>
           <w:p>
+            <w:pPr>
+              <w:spacing w:after="0"/>
+            </w:pPr>
             <w:r>
               <w:rPr>
                 <w:rFonts w:ascii="Times New Roman" w:hAnsi="Times New Roman"/>
@@ -3522,10 +3708,10 @@
         </w:tc>
       </w:tr>
     </w:tbl>
-    <w:p/>
     <w:p>
       <w:pPr>
         <w:pStyle w:val="Heading1"/>
+        <w:spacing w:before="200" w:after="120"/>
       </w:pPr>
       <w:r>
         <w:t>CHAPTER 5: SYSTEM IMPLEMENTATION</w:t>
@@ -3533,6 +3719,7 @@
     </w:p>
     <w:p>
       <w:pPr>
+        <w:spacing w:line="360" w:lineRule="auto" w:after="120" w:before="0"/>
         <w:jc w:val="both"/>
       </w:pPr>
       <w:r>
@@ -3542,6 +3729,7 @@
     <w:p>
       <w:pPr>
         <w:pStyle w:val="Heading2"/>
+        <w:spacing w:before="200" w:after="120"/>
       </w:pPr>
       <w:r>
         <w:t>5.1 Hardware Setup</w:t>
@@ -3549,6 +3737,7 @@
     </w:p>
     <w:p>
       <w:pPr>
+        <w:spacing w:line="360" w:lineRule="auto" w:after="120" w:before="0"/>
         <w:jc w:val="both"/>
       </w:pPr>
       <w:r>
@@ -3557,6 +3746,7 @@
     </w:p>
     <w:p>
       <w:pPr>
+        <w:spacing w:line="360" w:lineRule="auto" w:after="120" w:before="0"/>
         <w:jc w:val="both"/>
       </w:pPr>
       <w:r>
@@ -3934,9 +4124,9 @@
         </w:tc>
       </w:tr>
     </w:tbl>
-    <w:p/>
     <w:p>
       <w:pPr>
+        <w:spacing w:line="360" w:lineRule="auto" w:after="120" w:before="0"/>
         <w:jc w:val="both"/>
       </w:pPr>
       <w:r>
@@ -3960,6 +4150,7 @@
           </w:tcPr>
           <w:p>
             <w:pPr>
+              <w:spacing w:after="0"/>
               <w:jc w:val="center"/>
             </w:pPr>
             <w:r>
@@ -3975,10 +4166,10 @@
         </w:tc>
       </w:tr>
     </w:tbl>
-    <w:p/>
     <w:p>
       <w:pPr>
         <w:pStyle w:val="Heading2"/>
+        <w:spacing w:before="200" w:after="120"/>
       </w:pPr>
       <w:r>
         <w:t>5.2 Software Setup</w:t>
@@ -3986,6 +4177,7 @@
     </w:p>
     <w:p>
       <w:pPr>
+        <w:spacing w:line="360" w:lineRule="auto" w:after="120" w:before="0"/>
         <w:jc w:val="both"/>
       </w:pPr>
       <w:r>
@@ -3994,6 +4186,7 @@
     </w:p>
     <w:p>
       <w:pPr>
+        <w:spacing w:line="360" w:lineRule="auto" w:after="120" w:before="0"/>
         <w:jc w:val="both"/>
       </w:pPr>
       <w:r>
@@ -4471,9 +4664,9 @@
         </w:tc>
       </w:tr>
     </w:tbl>
-    <w:p/>
     <w:p>
       <w:pPr>
+        <w:spacing w:line="360" w:lineRule="auto" w:after="120" w:before="0"/>
         <w:jc w:val="both"/>
       </w:pPr>
       <w:r>
@@ -4482,6 +4675,7 @@
     </w:p>
     <w:p>
       <w:pPr>
+        <w:spacing w:line="360" w:lineRule="auto" w:after="120" w:before="0"/>
         <w:jc w:val="both"/>
       </w:pPr>
       <w:r>
@@ -4491,6 +4685,7 @@
     <w:p>
       <w:pPr>
         <w:pStyle w:val="Heading2"/>
+        <w:spacing w:before="200" w:after="120"/>
       </w:pPr>
       <w:r>
         <w:t>5.3 Setting and Configuration</w:t>
@@ -4498,6 +4693,7 @@
     </w:p>
     <w:p>
       <w:pPr>
+        <w:spacing w:line="360" w:lineRule="auto" w:after="120" w:before="0"/>
         <w:jc w:val="both"/>
       </w:pPr>
       <w:r>
@@ -4506,6 +4702,7 @@
     </w:p>
     <w:p>
       <w:pPr>
+        <w:spacing w:line="360" w:lineRule="auto" w:after="120" w:before="0"/>
         <w:jc w:val="both"/>
       </w:pPr>
       <w:r>
@@ -4933,10 +5130,10 @@
         </w:tc>
       </w:tr>
     </w:tbl>
-    <w:p/>
     <w:p>
       <w:pPr>
         <w:pStyle w:val="Heading2"/>
+        <w:spacing w:before="200" w:after="120"/>
       </w:pPr>
       <w:r>
         <w:t>5.4 System Operation (with Screenshots)</w:t>
@@ -4944,6 +5141,7 @@
     </w:p>
     <w:p>
       <w:pPr>
+        <w:spacing w:line="360" w:lineRule="auto" w:after="120" w:before="0"/>
         <w:jc w:val="both"/>
       </w:pPr>
       <w:r>
@@ -4952,6 +5150,7 @@
     </w:p>
     <w:p>
       <w:pPr>
+        <w:spacing w:line="360" w:lineRule="auto" w:after="120" w:before="0"/>
         <w:jc w:val="both"/>
       </w:pPr>
       <w:r>
@@ -4975,6 +5174,7 @@
           </w:tcPr>
           <w:p>
             <w:pPr>
+              <w:spacing w:after="0"/>
               <w:jc w:val="center"/>
             </w:pPr>
             <w:r>
@@ -4990,7 +5190,6 @@
         </w:tc>
       </w:tr>
     </w:tbl>
-    <w:p/>
     <w:tbl>
       <w:tblPr>
         <w:tblStyle w:val="TableGrid"/>
@@ -5008,6 +5207,7 @@
           </w:tcPr>
           <w:p>
             <w:pPr>
+              <w:spacing w:after="0"/>
               <w:jc w:val="center"/>
             </w:pPr>
             <w:r>
@@ -5023,7 +5223,6 @@
         </w:tc>
       </w:tr>
     </w:tbl>
-    <w:p/>
     <w:tbl>
       <w:tblPr>
         <w:tblStyle w:val="TableGrid"/>
@@ -5041,6 +5240,7 @@
           </w:tcPr>
           <w:p>
             <w:pPr>
+              <w:spacing w:after="0"/>
               <w:jc w:val="center"/>
             </w:pPr>
             <w:r>
@@ -5056,7 +5256,6 @@
         </w:tc>
       </w:tr>
     </w:tbl>
-    <w:p/>
     <w:p>
       <w:r>
         <w:br w:type="page"/>
@@ -5078,6 +5277,9 @@
             <w:shd w:val="clear" w:fill="D9E2F3"/>
           </w:tcPr>
           <w:p>
+            <w:pPr>
+              <w:spacing w:after="40"/>
+            </w:pPr>
             <w:r>
               <w:rPr>
                 <w:rFonts w:ascii="Times New Roman" w:hAnsi="Times New Roman"/>
@@ -5089,6 +5291,9 @@
             </w:r>
           </w:p>
           <w:p>
+            <w:pPr>
+              <w:spacing w:after="40"/>
+            </w:pPr>
             <w:r>
               <w:rPr>
                 <w:rFonts w:ascii="Times New Roman" w:hAnsi="Times New Roman"/>
@@ -5099,6 +5304,9 @@
             </w:r>
           </w:p>
           <w:p>
+            <w:pPr>
+              <w:spacing w:after="0"/>
+            </w:pPr>
             <w:r>
               <w:rPr>
                 <w:rFonts w:ascii="Times New Roman" w:hAnsi="Times New Roman"/>
@@ -5112,10 +5320,10 @@
         </w:tc>
       </w:tr>
     </w:tbl>
-    <w:p/>
     <w:p>
       <w:pPr>
         <w:pStyle w:val="Heading1"/>
+        <w:spacing w:before="200" w:after="120"/>
       </w:pPr>
       <w:r>
         <w:t>CHAPTER 6: SYSTEM EVALUATION AND DISCUSSION</w:t>
@@ -5123,6 +5331,7 @@
     </w:p>
     <w:p>
       <w:pPr>
+        <w:spacing w:line="360" w:lineRule="auto" w:after="120" w:before="0"/>
         <w:jc w:val="both"/>
       </w:pPr>
       <w:r>
@@ -5150,6 +5359,9 @@
             <w:shd w:val="clear" w:fill="D9E2F3"/>
           </w:tcPr>
           <w:p>
+            <w:pPr>
+              <w:spacing w:after="40"/>
+            </w:pPr>
             <w:r>
               <w:rPr>
                 <w:rFonts w:ascii="Times New Roman" w:hAnsi="Times New Roman"/>
@@ -5161,6 +5373,9 @@
             </w:r>
           </w:p>
           <w:p>
+            <w:pPr>
+              <w:spacing w:after="40"/>
+            </w:pPr>
             <w:r>
               <w:rPr>
                 <w:rFonts w:ascii="Times New Roman" w:hAnsi="Times New Roman"/>
@@ -5171,6 +5386,9 @@
             </w:r>
           </w:p>
           <w:p>
+            <w:pPr>
+              <w:spacing w:after="0"/>
+            </w:pPr>
             <w:r>
               <w:rPr>
                 <w:rFonts w:ascii="Times New Roman" w:hAnsi="Times New Roman"/>
@@ -5184,10 +5402,10 @@
         </w:tc>
       </w:tr>
     </w:tbl>
-    <w:p/>
     <w:p>
       <w:pPr>
         <w:pStyle w:val="Heading3"/>
+        <w:spacing w:before="200" w:after="120"/>
       </w:pPr>
       <w:r>
         <w:t>6.2.2 Classifier and Feature-Group Comparison (Objective 3)</w:t>
@@ -5195,6 +5413,7 @@
     </w:p>
     <w:p>
       <w:pPr>
+        <w:spacing w:line="360" w:lineRule="auto" w:after="120" w:before="0"/>
         <w:jc w:val="both"/>
       </w:pPr>
       <w:r>
@@ -5203,6 +5422,7 @@
     </w:p>
     <w:p>
       <w:pPr>
+        <w:spacing w:line="360" w:lineRule="auto" w:after="120" w:before="0"/>
         <w:jc w:val="both"/>
       </w:pPr>
       <w:r>
@@ -6127,9 +6347,9 @@
         </w:tc>
       </w:tr>
     </w:tbl>
-    <w:p/>
     <w:p>
       <w:pPr>
+        <w:spacing w:line="360" w:lineRule="auto" w:after="120" w:before="0"/>
         <w:jc w:val="both"/>
       </w:pPr>
       <w:r>
@@ -6138,6 +6358,7 @@
     </w:p>
     <w:p>
       <w:pPr>
+        <w:spacing w:line="360" w:lineRule="auto" w:after="120" w:before="0"/>
         <w:jc w:val="both"/>
       </w:pPr>
       <w:r>
@@ -6146,6 +6367,7 @@
     </w:p>
     <w:p>
       <w:pPr>
+        <w:spacing w:line="360" w:lineRule="auto" w:after="120" w:before="0"/>
         <w:jc w:val="both"/>
       </w:pPr>
       <w:r>
@@ -6173,6 +6395,9 @@
             <w:shd w:val="clear" w:fill="D9E2F3"/>
           </w:tcPr>
           <w:p>
+            <w:pPr>
+              <w:spacing w:after="40"/>
+            </w:pPr>
             <w:r>
               <w:rPr>
                 <w:rFonts w:ascii="Times New Roman" w:hAnsi="Times New Roman"/>
@@ -6184,6 +6409,9 @@
             </w:r>
           </w:p>
           <w:p>
+            <w:pPr>
+              <w:spacing w:after="40"/>
+            </w:pPr>
             <w:r>
               <w:rPr>
                 <w:rFonts w:ascii="Times New Roman" w:hAnsi="Times New Roman"/>
@@ -6194,6 +6422,9 @@
             </w:r>
           </w:p>
           <w:p>
+            <w:pPr>
+              <w:spacing w:after="0"/>
+            </w:pPr>
             <w:r>
               <w:rPr>
                 <w:rFonts w:ascii="Times New Roman" w:hAnsi="Times New Roman"/>
@@ -6207,10 +6438,10 @@
         </w:tc>
       </w:tr>
     </w:tbl>
-    <w:p/>
     <w:p>
       <w:pPr>
         <w:pStyle w:val="Heading3"/>
+        <w:spacing w:before="200" w:after="120"/>
       </w:pPr>
       <w:r>
         <w:t>6.2.4 Adaptive Improvement (Objective 4)</w:t>
@@ -6218,6 +6449,7 @@
     </w:p>
     <w:p>
       <w:pPr>
+        <w:spacing w:line="360" w:lineRule="auto" w:after="120" w:before="0"/>
         <w:jc w:val="both"/>
       </w:pPr>
       <w:r>
@@ -6226,6 +6458,7 @@
     </w:p>
     <w:p>
       <w:pPr>
+        <w:spacing w:line="360" w:lineRule="auto" w:after="120" w:before="0"/>
         <w:jc w:val="both"/>
       </w:pPr>
       <w:r>
@@ -6629,9 +6862,9 @@
         </w:tc>
       </w:tr>
     </w:tbl>
-    <w:p/>
     <w:p>
       <w:pPr>
+        <w:spacing w:line="360" w:lineRule="auto" w:after="120" w:before="0"/>
         <w:jc w:val="both"/>
       </w:pPr>
       <w:r>
@@ -6655,6 +6888,7 @@
           </w:tcPr>
           <w:p>
             <w:pPr>
+              <w:spacing w:after="0"/>
               <w:jc w:val="center"/>
             </w:pPr>
             <w:r>
@@ -6670,10 +6904,10 @@
         </w:tc>
       </w:tr>
     </w:tbl>
-    <w:p/>
     <w:p>
       <w:pPr>
         <w:pStyle w:val="Heading3"/>
+        <w:spacing w:before="200" w:after="120"/>
       </w:pPr>
       <w:r>
         <w:t>6.2.5 Comparison with Existing Systems and Commercial Filters</w:t>
@@ -6681,6 +6915,7 @@
     </w:p>
     <w:p>
       <w:pPr>
+        <w:spacing w:line="360" w:lineRule="auto" w:after="120" w:before="0"/>
         <w:jc w:val="both"/>
       </w:pPr>
       <w:r>
@@ -6689,6 +6924,7 @@
     </w:p>
     <w:p>
       <w:pPr>
+        <w:spacing w:line="360" w:lineRule="auto" w:after="120" w:before="0"/>
         <w:jc w:val="both"/>
       </w:pPr>
       <w:r>
@@ -6697,6 +6933,7 @@
     </w:p>
     <w:p>
       <w:pPr>
+        <w:spacing w:line="360" w:lineRule="auto" w:after="120" w:before="0"/>
         <w:jc w:val="both"/>
       </w:pPr>
       <w:r>
@@ -7356,9 +7593,9 @@
         </w:tc>
       </w:tr>
     </w:tbl>
-    <w:p/>
     <w:p>
       <w:pPr>
+        <w:spacing w:line="360" w:lineRule="auto" w:after="120" w:before="0"/>
         <w:jc w:val="both"/>
       </w:pPr>
       <w:r>
@@ -7367,6 +7604,7 @@
     </w:p>
     <w:p>
       <w:pPr>
+        <w:spacing w:line="360" w:lineRule="auto" w:after="120" w:before="0"/>
         <w:jc w:val="both"/>
       </w:pPr>
       <w:r>
@@ -7894,9 +8132,9 @@
         </w:tc>
       </w:tr>
     </w:tbl>
-    <w:p/>
     <w:p>
       <w:pPr>
+        <w:spacing w:line="360" w:lineRule="auto" w:after="120" w:before="0"/>
         <w:jc w:val="both"/>
       </w:pPr>
       <w:r>
@@ -7924,6 +8162,9 @@
             <w:shd w:val="clear" w:fill="D9E2F3"/>
           </w:tcPr>
           <w:p>
+            <w:pPr>
+              <w:spacing w:after="40"/>
+            </w:pPr>
             <w:r>
               <w:rPr>
                 <w:rFonts w:ascii="Times New Roman" w:hAnsi="Times New Roman"/>
@@ -7935,6 +8176,9 @@
             </w:r>
           </w:p>
           <w:p>
+            <w:pPr>
+              <w:spacing w:after="40"/>
+            </w:pPr>
             <w:r>
               <w:rPr>
                 <w:rFonts w:ascii="Times New Roman" w:hAnsi="Times New Roman"/>
@@ -7945,6 +8189,9 @@
             </w:r>
           </w:p>
           <w:p>
+            <w:pPr>
+              <w:spacing w:after="0"/>
+            </w:pPr>
             <w:r>
               <w:rPr>
                 <w:rFonts w:ascii="Times New Roman" w:hAnsi="Times New Roman"/>
@@ -7958,10 +8205,10 @@
         </w:tc>
       </w:tr>
     </w:tbl>
-    <w:p/>
     <w:p>
       <w:pPr>
         <w:pStyle w:val="Heading2"/>
+        <w:spacing w:before="200" w:after="120"/>
       </w:pPr>
       <w:r>
         <w:t>6.4 Objectives Evaluation</w:t>
@@ -7969,6 +8216,7 @@
     </w:p>
     <w:p>
       <w:pPr>
+        <w:spacing w:line="360" w:lineRule="auto" w:after="120" w:before="0"/>
         <w:jc w:val="both"/>
       </w:pPr>
       <w:r>
@@ -7977,6 +8225,7 @@
     </w:p>
     <w:p>
       <w:pPr>
+        <w:spacing w:line="360" w:lineRule="auto" w:after="120" w:before="0"/>
         <w:jc w:val="both"/>
       </w:pPr>
       <w:r>
@@ -8378,7 +8627,6 @@
         </w:tc>
       </w:tr>
     </w:tbl>
-    <w:p/>
     <w:p>
       <w:r>
         <w:br w:type="page"/>
@@ -8400,6 +8648,9 @@
             <w:shd w:val="clear" w:fill="D9E2F3"/>
           </w:tcPr>
           <w:p>
+            <w:pPr>
+              <w:spacing w:after="40"/>
+            </w:pPr>
             <w:r>
               <w:rPr>
                 <w:rFonts w:ascii="Times New Roman" w:hAnsi="Times New Roman"/>
@@ -8411,6 +8662,9 @@
             </w:r>
           </w:p>
           <w:p>
+            <w:pPr>
+              <w:spacing w:after="40"/>
+            </w:pPr>
             <w:r>
               <w:rPr>
                 <w:rFonts w:ascii="Times New Roman" w:hAnsi="Times New Roman"/>
@@ -8421,6 +8675,9 @@
             </w:r>
           </w:p>
           <w:p>
+            <w:pPr>
+              <w:spacing w:after="0"/>
+            </w:pPr>
             <w:r>
               <w:rPr>
                 <w:rFonts w:ascii="Times New Roman" w:hAnsi="Times New Roman"/>
@@ -8434,10 +8691,10 @@
         </w:tc>
       </w:tr>
     </w:tbl>
-    <w:p/>
     <w:p>
       <w:pPr>
         <w:pStyle w:val="Heading1"/>
+        <w:spacing w:before="200" w:after="120"/>
       </w:pPr>
       <w:r>
         <w:t>CHAPTER 7: CONCLUSION AND RECOMMENDATION</w:t>
@@ -8445,6 +8702,7 @@
     </w:p>
     <w:p>
       <w:pPr>
+        <w:spacing w:line="360" w:lineRule="auto" w:after="120" w:before="0"/>
         <w:jc w:val="both"/>
       </w:pPr>
       <w:r>
@@ -8472,6 +8730,9 @@
             <w:shd w:val="clear" w:fill="D9E2F3"/>
           </w:tcPr>
           <w:p>
+            <w:pPr>
+              <w:spacing w:after="40"/>
+            </w:pPr>
             <w:r>
               <w:rPr>
                 <w:rFonts w:ascii="Times New Roman" w:hAnsi="Times New Roman"/>
@@ -8483,6 +8744,9 @@
             </w:r>
           </w:p>
           <w:p>
+            <w:pPr>
+              <w:spacing w:after="40"/>
+            </w:pPr>
             <w:r>
               <w:rPr>
                 <w:rFonts w:ascii="Times New Roman" w:hAnsi="Times New Roman"/>
@@ -8493,6 +8757,9 @@
             </w:r>
           </w:p>
           <w:p>
+            <w:pPr>
+              <w:spacing w:after="0"/>
+            </w:pPr>
             <w:r>
               <w:rPr>
                 <w:rFonts w:ascii="Times New Roman" w:hAnsi="Times New Roman"/>
@@ -8506,10 +8773,10 @@
         </w:tc>
       </w:tr>
     </w:tbl>
-    <w:p/>
     <w:p>
       <w:pPr>
         <w:pStyle w:val="Heading2"/>
+        <w:spacing w:before="200" w:after="120"/>
       </w:pPr>
       <w:r>
         <w:t>Appendix B — Full Classifier Output and Confusion Matrices</w:t>
@@ -8517,6 +8784,7 @@
     </w:p>
     <w:p>
       <w:pPr>
+        <w:spacing w:line="360" w:lineRule="auto" w:after="120" w:before="0"/>
         <w:jc w:val="both"/>
       </w:pPr>
       <w:r>
@@ -8544,6 +8812,9 @@
             <w:shd w:val="clear" w:fill="D9E2F3"/>
           </w:tcPr>
           <w:p>
+            <w:pPr>
+              <w:spacing w:after="40"/>
+            </w:pPr>
             <w:r>
               <w:rPr>
                 <w:rFonts w:ascii="Times New Roman" w:hAnsi="Times New Roman"/>
@@ -8555,6 +8826,9 @@
             </w:r>
           </w:p>
           <w:p>
+            <w:pPr>
+              <w:spacing w:after="40"/>
+            </w:pPr>
             <w:r>
               <w:rPr>
                 <w:rFonts w:ascii="Times New Roman" w:hAnsi="Times New Roman"/>
@@ -8565,6 +8839,9 @@
             </w:r>
           </w:p>
           <w:p>
+            <w:pPr>
+              <w:spacing w:after="0"/>
+            </w:pPr>
             <w:r>
               <w:rPr>
                 <w:rFonts w:ascii="Times New Roman" w:hAnsi="Times New Roman"/>
@@ -8578,10 +8855,10 @@
         </w:tc>
       </w:tr>
     </w:tbl>
-    <w:p/>
     <w:p>
       <w:pPr>
         <w:pStyle w:val="Heading2"/>
+        <w:spacing w:before="200" w:after="120"/>
       </w:pPr>
       <w:r>
         <w:t>Appendix D — Command Reference and System Screenshots</w:t>
@@ -8589,6 +8866,7 @@
     </w:p>
     <w:p>
       <w:pPr>
+        <w:spacing w:line="360" w:lineRule="auto" w:after="120" w:before="0"/>
         <w:jc w:val="both"/>
       </w:pPr>
       <w:r>
@@ -8623,7 +8901,7 @@
     </w:p>
     <w:p>
       <w:pPr>
-        <w:spacing w:after="0" w:line="240" w:lineRule="auto"/>
+        <w:spacing w:after="120" w:line="240" w:lineRule="auto"/>
       </w:pPr>
       <w:r>
         <w:rPr>
@@ -8634,9 +8912,9 @@
         <w:t>pip install -r requirements.txt</w:t>
       </w:r>
     </w:p>
-    <w:p/>
     <w:p>
       <w:pPr>
+        <w:spacing w:line="360" w:lineRule="auto" w:after="120" w:before="0"/>
         <w:jc w:val="both"/>
       </w:pPr>
       <w:r>
@@ -8775,7 +9053,7 @@
     </w:p>
     <w:p>
       <w:pPr>
-        <w:spacing w:after="0" w:line="240" w:lineRule="auto"/>
+        <w:spacing w:after="120" w:line="240" w:lineRule="auto"/>
       </w:pPr>
       <w:r>
         <w:rPr>
@@ -8786,18 +9064,13 @@
         <w:t>python -m spam_detection.scan_mailbox mail_inbox --action quarantine --watch</w:t>
       </w:r>
     </w:p>
-    <w:p/>
     <w:p>
       <w:pPr>
+        <w:spacing w:line="360" w:lineRule="auto" w:after="120" w:before="0"/>
         <w:jc w:val="both"/>
       </w:pPr>
       <w:r>
         <w:t>[FILL IN: add any further screenshots not placed in Chapter 5, e.g. the training output and the threshold-sweep output.]</w:t>
-      </w:r>
-    </w:p>
-    <w:p>
-      <w:r>
-        <w:br w:type="page"/>
       </w:r>
     </w:p>
     <w:sectPr>

</xml_diff>